<commit_message>
insert dismissal for hours
</commit_message>
<xml_diff>
--- a/flow/20230927_hours/drafts/2024-08-u/01.08.docx
+++ b/flow/20230927_hours/drafts/2024-08-u/01.08.docx
@@ -47,24 +47,17 @@
         <w:rPr>
           <w:rFonts w:ascii="Times New Roman" w:hAnsi="Times New Roman"/>
           <w:i/>
-          <w:color w:val="FF0000"/>
-          <w:sz w:val="24"/>
-        </w:rPr>
-        <w:t xml:space="preserve">Священик: </w:t>
-      </w:r>
-      <w:r>
-        <w:rPr>
-          <w:rFonts w:ascii="Times New Roman" w:hAnsi="Times New Roman"/>
-          <w:sz w:val="24"/>
-        </w:rPr>
-        <w:t xml:space="preserve">Благословенний Бог наш завжди, нині і повсякчас, і на віки </w:t>
-      </w:r>
-      <w:r>
-        <w:rPr>
-          <w:rFonts w:ascii="Times New Roman" w:hAnsi="Times New Roman"/>
-          <w:sz w:val="24"/>
-        </w:rPr>
-        <w:t>віків.</w:t>
+          <w:color w:val="FF4400"/>
+          <w:sz w:val="24"/>
+        </w:rPr>
+        <w:t>Священик:</w:t>
+      </w:r>
+      <w:r>
+        <w:rPr>
+          <w:rFonts w:ascii="Times New Roman" w:hAnsi="Times New Roman"/>
+          <w:sz w:val="24"/>
+        </w:rPr>
+        <w:t xml:space="preserve"> Благословенний Бог наш завжди, нині і повсякчас, і на віки віків.</w:t>
       </w:r>
     </w:p>
     <w:p>
@@ -2216,17 +2209,17 @@
         <w:rPr>
           <w:rFonts w:ascii="Times New Roman" w:hAnsi="Times New Roman"/>
           <w:i/>
-          <w:color w:val="FF0000"/>
-          <w:sz w:val="24"/>
-        </w:rPr>
-        <w:t xml:space="preserve">Священик: </w:t>
-      </w:r>
-      <w:r>
-        <w:rPr>
-          <w:rFonts w:ascii="Times New Roman" w:hAnsi="Times New Roman"/>
-          <w:sz w:val="24"/>
-        </w:rPr>
-        <w:t>Боже, змилуйся над нами і благослови нас; світлом лиця твого осяй нас і помилуй нас.</w:t>
+          <w:color w:val="FF4400"/>
+          <w:sz w:val="24"/>
+        </w:rPr>
+        <w:t>Священик:</w:t>
+      </w:r>
+      <w:r>
+        <w:rPr>
+          <w:rFonts w:ascii="Times New Roman" w:hAnsi="Times New Roman"/>
+          <w:sz w:val="24"/>
+        </w:rPr>
+        <w:t xml:space="preserve"> Боже, змилуйся над нами і благослови нас; світлом лиця твого осяй нас і помилуй нас.</w:t>
       </w:r>
     </w:p>
     <w:p>
@@ -2365,17 +2358,17 @@
         <w:rPr>
           <w:rFonts w:ascii="Times New Roman" w:hAnsi="Times New Roman"/>
           <w:i/>
-          <w:color w:val="FF0000"/>
-          <w:sz w:val="24"/>
-        </w:rPr>
-        <w:t xml:space="preserve">Священик: </w:t>
-      </w:r>
-      <w:r>
-        <w:rPr>
-          <w:rFonts w:ascii="Times New Roman" w:hAnsi="Times New Roman"/>
-          <w:sz w:val="24"/>
-        </w:rPr>
-        <w:t>Слава тобі, Христе Боже, надіє наша, слава тобі!</w:t>
+          <w:color w:val="FF4400"/>
+          <w:sz w:val="24"/>
+        </w:rPr>
+        <w:t>Священик:</w:t>
+      </w:r>
+      <w:r>
+        <w:rPr>
+          <w:rFonts w:ascii="Times New Roman" w:hAnsi="Times New Roman"/>
+          <w:sz w:val="24"/>
+        </w:rPr>
+        <w:t xml:space="preserve"> Слава тобі, Христе Боже, надіє наша, слава тобі!</w:t>
       </w:r>
     </w:p>
     <w:p>
@@ -2449,27 +2442,39 @@
     </w:p>
     <w:p>
       <w:pPr>
-        <w:spacing w:line="240" w:lineRule="auto"/>
-        <w:rPr>
-          <w:rFonts w:ascii="Times New Roman" w:hAnsi="Times New Roman"/>
-          <w:sz w:val="24"/>
-        </w:rPr>
-      </w:pPr>
-      <w:r>
-        <w:rPr>
-          <w:rFonts w:ascii="Times New Roman" w:hAnsi="Times New Roman"/>
-          <w:i/>
-          <w:color w:val="FF0000"/>
-          <w:sz w:val="24"/>
-        </w:rPr>
-        <w:t xml:space="preserve">Священик: </w:t>
-      </w:r>
-      <w:r>
-        <w:rPr>
-          <w:rFonts w:ascii="Times New Roman" w:hAnsi="Times New Roman"/>
-          <w:sz w:val="24"/>
-        </w:rPr>
-        <w:t>Христос, істинний Бог наш, молитвами пречистої своєї Матері, преподобних і богоносних отців наших, і всіх святих, помилує і спасе нас, як благий і чоловіколюбець.</w:t>
+        <w:spacing w:after="120"/>
+      </w:pPr>
+      <w:r>
+        <w:rPr>
+          <w:rFonts w:ascii="Times New Roman" w:hAnsi="Times New Roman"/>
+          <w:i/>
+          <w:color w:val="FF4400"/>
+          <w:sz w:val="24"/>
+        </w:rPr>
+        <w:t>Священик:</w:t>
+      </w:r>
+      <w:r>
+        <w:rPr>
+          <w:rFonts w:ascii="Times New Roman" w:hAnsi="Times New Roman"/>
+          <w:sz w:val="24"/>
+        </w:rPr>
+        <w:t xml:space="preserve"> Христос, істинний Бог наш - молитвами пречистої Своєї Матері, силою чесного і животворчого Xреста, що з його чесним Древом походу сьогодні пам'ять звершуємо, святих славних і всехвальних апостолів, святого, </w:t>
+      </w:r>
+      <w:r>
+        <w:rPr>
+          <w:rFonts w:ascii="Times New Roman" w:hAnsi="Times New Roman"/>
+          <w:i/>
+          <w:color w:val="FF4400"/>
+          <w:sz w:val="24"/>
+        </w:rPr>
+        <w:t>якого є храм</w:t>
+      </w:r>
+      <w:r>
+        <w:rPr>
+          <w:rFonts w:ascii="Times New Roman" w:hAnsi="Times New Roman"/>
+          <w:sz w:val="24"/>
+        </w:rPr>
+        <w:t>, святих сімох мучеників Макавеїв, і матері їх Соломії, і старця Єлеазара, преподобного отця нашого Альфонса Лігуорі, і всіх святих - помилує і спасе нас як благий і людинолюбний.</w:t>
       </w:r>
     </w:p>
     <w:p>
@@ -2559,24 +2564,17 @@
         <w:rPr>
           <w:rFonts w:ascii="Times New Roman" w:hAnsi="Times New Roman"/>
           <w:i/>
-          <w:color w:val="FF0000"/>
-          <w:sz w:val="24"/>
-        </w:rPr>
-        <w:t xml:space="preserve">Священик: </w:t>
-      </w:r>
-      <w:r>
-        <w:rPr>
-          <w:rFonts w:ascii="Times New Roman" w:hAnsi="Times New Roman"/>
-          <w:sz w:val="24"/>
-        </w:rPr>
-        <w:t xml:space="preserve">Благословенний Бог наш завжди, нині і повсякчас, і на віки </w:t>
-      </w:r>
-      <w:r>
-        <w:rPr>
-          <w:rFonts w:ascii="Times New Roman" w:hAnsi="Times New Roman"/>
-          <w:sz w:val="24"/>
-        </w:rPr>
-        <w:t>віків.</w:t>
+          <w:color w:val="FF4400"/>
+          <w:sz w:val="24"/>
+        </w:rPr>
+        <w:t>Священик:</w:t>
+      </w:r>
+      <w:r>
+        <w:rPr>
+          <w:rFonts w:ascii="Times New Roman" w:hAnsi="Times New Roman"/>
+          <w:sz w:val="24"/>
+        </w:rPr>
+        <w:t xml:space="preserve"> Благословенний Бог наш завжди, нині і повсякчас, і на віки віків.</w:t>
       </w:r>
     </w:p>
     <w:p>
@@ -5199,17 +5197,17 @@
         <w:rPr>
           <w:rFonts w:ascii="Times New Roman" w:hAnsi="Times New Roman"/>
           <w:i/>
-          <w:color w:val="FF0000"/>
-          <w:sz w:val="24"/>
-        </w:rPr>
-        <w:t xml:space="preserve">Священик: </w:t>
-      </w:r>
-      <w:r>
-        <w:rPr>
-          <w:rFonts w:ascii="Times New Roman" w:hAnsi="Times New Roman"/>
-          <w:sz w:val="24"/>
-        </w:rPr>
-        <w:t>Молитвами святих отців наших, Господи Ісусе Христе Сине Божий, помилуй нас.</w:t>
+          <w:color w:val="FF4400"/>
+          <w:sz w:val="24"/>
+        </w:rPr>
+        <w:t>Священик:</w:t>
+      </w:r>
+      <w:r>
+        <w:rPr>
+          <w:rFonts w:ascii="Times New Roman" w:hAnsi="Times New Roman"/>
+          <w:sz w:val="24"/>
+        </w:rPr>
+        <w:t xml:space="preserve"> Молитвами святих отців наших, Господи Ісусе Христе Сине Божий, помилуй нас.</w:t>
       </w:r>
     </w:p>
     <w:p>
@@ -5449,17 +5447,17 @@
         <w:rPr>
           <w:rFonts w:ascii="Times New Roman" w:hAnsi="Times New Roman"/>
           <w:i/>
-          <w:color w:val="FF0000"/>
-          <w:sz w:val="24"/>
-        </w:rPr>
-        <w:t xml:space="preserve">Священик: </w:t>
-      </w:r>
-      <w:r>
-        <w:rPr>
-          <w:rFonts w:ascii="Times New Roman" w:hAnsi="Times New Roman"/>
-          <w:sz w:val="24"/>
-        </w:rPr>
-        <w:t>Слава тобі, Христе Боже, надіє наша, слава тобі!</w:t>
+          <w:color w:val="FF4400"/>
+          <w:sz w:val="24"/>
+        </w:rPr>
+        <w:t>Священик:</w:t>
+      </w:r>
+      <w:r>
+        <w:rPr>
+          <w:rFonts w:ascii="Times New Roman" w:hAnsi="Times New Roman"/>
+          <w:sz w:val="24"/>
+        </w:rPr>
+        <w:t xml:space="preserve"> Слава тобі, Христе Боже, надіє наша, слава тобі!</w:t>
       </w:r>
     </w:p>
     <w:p>
@@ -5533,27 +5531,39 @@
     </w:p>
     <w:p>
       <w:pPr>
-        <w:spacing w:line="240" w:lineRule="auto"/>
-        <w:rPr>
-          <w:rFonts w:ascii="Times New Roman" w:hAnsi="Times New Roman"/>
-          <w:sz w:val="24"/>
-        </w:rPr>
-      </w:pPr>
-      <w:r>
-        <w:rPr>
-          <w:rFonts w:ascii="Times New Roman" w:hAnsi="Times New Roman"/>
-          <w:i/>
-          <w:color w:val="FF0000"/>
-          <w:sz w:val="24"/>
-        </w:rPr>
-        <w:t xml:space="preserve">Священик: </w:t>
-      </w:r>
-      <w:r>
-        <w:rPr>
-          <w:rFonts w:ascii="Times New Roman" w:hAnsi="Times New Roman"/>
-          <w:sz w:val="24"/>
-        </w:rPr>
-        <w:t>Христос, істинний Бог наш, молитвами пречистої своєї Матері, преподобних і богоносних отців наших, і всіх святих, помилує і спасе нас, як благий і чоловіколюбець.</w:t>
+        <w:spacing w:after="120"/>
+      </w:pPr>
+      <w:r>
+        <w:rPr>
+          <w:rFonts w:ascii="Times New Roman" w:hAnsi="Times New Roman"/>
+          <w:i/>
+          <w:color w:val="FF4400"/>
+          <w:sz w:val="24"/>
+        </w:rPr>
+        <w:t>Священик:</w:t>
+      </w:r>
+      <w:r>
+        <w:rPr>
+          <w:rFonts w:ascii="Times New Roman" w:hAnsi="Times New Roman"/>
+          <w:sz w:val="24"/>
+        </w:rPr>
+        <w:t xml:space="preserve"> Христос, істинний Бог наш - молитвами пречистої Своєї Матері, силою чесного і животворчого Xреста, що з його чесним Древом походу сьогодні пам'ять звершуємо, святих славних і всехвальних апостолів, святого, </w:t>
+      </w:r>
+      <w:r>
+        <w:rPr>
+          <w:rFonts w:ascii="Times New Roman" w:hAnsi="Times New Roman"/>
+          <w:i/>
+          <w:color w:val="FF4400"/>
+          <w:sz w:val="24"/>
+        </w:rPr>
+        <w:t>якого є храм</w:t>
+      </w:r>
+      <w:r>
+        <w:rPr>
+          <w:rFonts w:ascii="Times New Roman" w:hAnsi="Times New Roman"/>
+          <w:sz w:val="24"/>
+        </w:rPr>
+        <w:t>, святих сімох мучеників Макавеїв, і матері їх Соломії, і старця Єлеазара, преподобного отця нашого Альфонса Лігуорі, і всіх святих - помилує і спасе нас як благий і людинолюбний.</w:t>
       </w:r>
     </w:p>
     <w:p>
@@ -5643,24 +5653,17 @@
         <w:rPr>
           <w:rFonts w:ascii="Times New Roman" w:hAnsi="Times New Roman"/>
           <w:i/>
-          <w:color w:val="FF0000"/>
-          <w:sz w:val="24"/>
-        </w:rPr>
-        <w:t xml:space="preserve">Священик: </w:t>
-      </w:r>
-      <w:r>
-        <w:rPr>
-          <w:rFonts w:ascii="Times New Roman" w:hAnsi="Times New Roman"/>
-          <w:sz w:val="24"/>
-        </w:rPr>
-        <w:t xml:space="preserve">Благословенний Бог наш завжди, нині і повсякчас, і на віки </w:t>
-      </w:r>
-      <w:r>
-        <w:rPr>
-          <w:rFonts w:ascii="Times New Roman" w:hAnsi="Times New Roman"/>
-          <w:sz w:val="24"/>
-        </w:rPr>
-        <w:t>віків.</w:t>
+          <w:color w:val="FF4400"/>
+          <w:sz w:val="24"/>
+        </w:rPr>
+        <w:t>Священик:</w:t>
+      </w:r>
+      <w:r>
+        <w:rPr>
+          <w:rFonts w:ascii="Times New Roman" w:hAnsi="Times New Roman"/>
+          <w:sz w:val="24"/>
+        </w:rPr>
+        <w:t xml:space="preserve"> Благословенний Бог наш завжди, нині і повсякчас, і на віки віків.</w:t>
       </w:r>
     </w:p>
     <w:p>
@@ -7966,17 +7969,17 @@
         <w:rPr>
           <w:rFonts w:ascii="Times New Roman" w:hAnsi="Times New Roman"/>
           <w:i/>
-          <w:color w:val="FF0000"/>
-          <w:sz w:val="24"/>
-        </w:rPr>
-        <w:t xml:space="preserve">Священик: </w:t>
-      </w:r>
-      <w:r>
-        <w:rPr>
-          <w:rFonts w:ascii="Times New Roman" w:hAnsi="Times New Roman"/>
-          <w:sz w:val="24"/>
-        </w:rPr>
-        <w:t>Молитвами святих отців наших, Господи Ісусе Христе Сину Божий, помилуй нас.</w:t>
+          <w:color w:val="FF4400"/>
+          <w:sz w:val="24"/>
+        </w:rPr>
+        <w:t>Священик:</w:t>
+      </w:r>
+      <w:r>
+        <w:rPr>
+          <w:rFonts w:ascii="Times New Roman" w:hAnsi="Times New Roman"/>
+          <w:sz w:val="24"/>
+        </w:rPr>
+        <w:t xml:space="preserve"> Молитвами святих отців наших, Господи Ісусе Христе Сину Божий, помилуй нас.</w:t>
       </w:r>
     </w:p>
     <w:p>
@@ -8146,17 +8149,17 @@
         <w:rPr>
           <w:rFonts w:ascii="Times New Roman" w:hAnsi="Times New Roman"/>
           <w:i/>
-          <w:color w:val="FF0000"/>
-          <w:sz w:val="24"/>
-        </w:rPr>
-        <w:t xml:space="preserve">Священик: </w:t>
-      </w:r>
-      <w:r>
-        <w:rPr>
-          <w:rFonts w:ascii="Times New Roman" w:hAnsi="Times New Roman"/>
-          <w:sz w:val="24"/>
-        </w:rPr>
-        <w:t>Слава тобі, Христе Боже, надіє наша, слава тобі!</w:t>
+          <w:color w:val="FF4400"/>
+          <w:sz w:val="24"/>
+        </w:rPr>
+        <w:t>Священик:</w:t>
+      </w:r>
+      <w:r>
+        <w:rPr>
+          <w:rFonts w:ascii="Times New Roman" w:hAnsi="Times New Roman"/>
+          <w:sz w:val="24"/>
+        </w:rPr>
+        <w:t xml:space="preserve"> Слава тобі, Христе Боже, надіє наша, слава тобі!</w:t>
       </w:r>
     </w:p>
     <w:p>
@@ -8216,27 +8219,39 @@
     </w:p>
     <w:p>
       <w:pPr>
-        <w:spacing w:line="240" w:lineRule="auto"/>
-        <w:rPr>
-          <w:rFonts w:ascii="Times New Roman" w:hAnsi="Times New Roman"/>
-          <w:sz w:val="24"/>
-        </w:rPr>
-      </w:pPr>
-      <w:r>
-        <w:rPr>
-          <w:rFonts w:ascii="Times New Roman" w:hAnsi="Times New Roman"/>
-          <w:i/>
-          <w:color w:val="FF0000"/>
-          <w:sz w:val="24"/>
-        </w:rPr>
-        <w:t xml:space="preserve">Священик: </w:t>
-      </w:r>
-      <w:r>
-        <w:rPr>
-          <w:rFonts w:ascii="Times New Roman" w:hAnsi="Times New Roman"/>
-          <w:sz w:val="24"/>
-        </w:rPr>
-        <w:t>Христос, істинний Бог наш, молитвами пречистої своєї Матері, преподобних і богоносних отців наших, і всіх святих, помилує і спасе нас, як благий і чоловіколюбець.</w:t>
+        <w:spacing w:after="120"/>
+      </w:pPr>
+      <w:r>
+        <w:rPr>
+          <w:rFonts w:ascii="Times New Roman" w:hAnsi="Times New Roman"/>
+          <w:i/>
+          <w:color w:val="FF4400"/>
+          <w:sz w:val="24"/>
+        </w:rPr>
+        <w:t>Священик:</w:t>
+      </w:r>
+      <w:r>
+        <w:rPr>
+          <w:rFonts w:ascii="Times New Roman" w:hAnsi="Times New Roman"/>
+          <w:sz w:val="24"/>
+        </w:rPr>
+        <w:t xml:space="preserve"> Христос, істинний Бог наш - молитвами пречистої Своєї Матері, силою чесного і животворчого Xреста, що з його чесним Древом походу сьогодні пам'ять звершуємо, святих славних і всехвальних апостолів, святого, </w:t>
+      </w:r>
+      <w:r>
+        <w:rPr>
+          <w:rFonts w:ascii="Times New Roman" w:hAnsi="Times New Roman"/>
+          <w:i/>
+          <w:color w:val="FF4400"/>
+          <w:sz w:val="24"/>
+        </w:rPr>
+        <w:t>якого є храм</w:t>
+      </w:r>
+      <w:r>
+        <w:rPr>
+          <w:rFonts w:ascii="Times New Roman" w:hAnsi="Times New Roman"/>
+          <w:sz w:val="24"/>
+        </w:rPr>
+        <w:t>, святих сімох мучеників Макавеїв, і матері їх Соломії, і старця Єлеазара, преподобного отця нашого Альфонса Лігуорі, і всіх святих - помилує і спасе нас як благий і людинолюбний.</w:t>
       </w:r>
     </w:p>
     <w:p>
@@ -8326,7 +8341,7 @@
         <w:rPr>
           <w:rFonts w:ascii="Times New Roman" w:hAnsi="Times New Roman"/>
           <w:i/>
-          <w:color w:val="FF0000"/>
+          <w:color w:val="FF4400"/>
           <w:sz w:val="24"/>
         </w:rPr>
         <w:t>Священик:</w:t>
@@ -8336,14 +8351,7 @@
           <w:rFonts w:ascii="Times New Roman" w:hAnsi="Times New Roman"/>
           <w:sz w:val="24"/>
         </w:rPr>
-        <w:t xml:space="preserve"> Благословенний Бог наш завжди, нині і повсякчас, і на віки </w:t>
-      </w:r>
-      <w:r>
-        <w:rPr>
-          <w:rFonts w:ascii="Times New Roman" w:hAnsi="Times New Roman"/>
-          <w:sz w:val="24"/>
-        </w:rPr>
-        <w:t>віків.</w:t>
+        <w:t xml:space="preserve"> Благословенний Бог наш завжди, нині і повсякчас, і на віки віків.</w:t>
       </w:r>
     </w:p>
     <w:p>
@@ -10530,17 +10538,17 @@
         <w:rPr>
           <w:rFonts w:ascii="Times New Roman" w:hAnsi="Times New Roman"/>
           <w:i/>
-          <w:color w:val="FF0000"/>
-          <w:sz w:val="24"/>
-        </w:rPr>
-        <w:t xml:space="preserve">Священик: </w:t>
-      </w:r>
-      <w:r>
-        <w:rPr>
-          <w:rFonts w:ascii="Times New Roman" w:hAnsi="Times New Roman"/>
-          <w:sz w:val="24"/>
-        </w:rPr>
-        <w:t>Боже, змилуйся над нами і благослови нас; світлом лиця твого осяй нас і помилуй нас.</w:t>
+          <w:color w:val="FF4400"/>
+          <w:sz w:val="24"/>
+        </w:rPr>
+        <w:t>Священик:</w:t>
+      </w:r>
+      <w:r>
+        <w:rPr>
+          <w:rFonts w:ascii="Times New Roman" w:hAnsi="Times New Roman"/>
+          <w:sz w:val="24"/>
+        </w:rPr>
+        <w:t xml:space="preserve"> Боже, змилуйся над нами і благослови нас; світлом лиця твого осяй нас і помилуй нас.</w:t>
       </w:r>
     </w:p>
     <w:p>
@@ -10705,17 +10713,17 @@
         <w:rPr>
           <w:rFonts w:ascii="Times New Roman" w:hAnsi="Times New Roman"/>
           <w:i/>
-          <w:color w:val="FF0000"/>
-          <w:sz w:val="24"/>
-        </w:rPr>
-        <w:t xml:space="preserve">Священик: </w:t>
-      </w:r>
-      <w:r>
-        <w:rPr>
-          <w:rFonts w:ascii="Times New Roman" w:hAnsi="Times New Roman"/>
-          <w:sz w:val="24"/>
-        </w:rPr>
-        <w:t>Слава тобі, Христе Боже, надіє наша, слава тобі!</w:t>
+          <w:color w:val="FF4400"/>
+          <w:sz w:val="24"/>
+        </w:rPr>
+        <w:t>Священик:</w:t>
+      </w:r>
+      <w:r>
+        <w:rPr>
+          <w:rFonts w:ascii="Times New Roman" w:hAnsi="Times New Roman"/>
+          <w:sz w:val="24"/>
+        </w:rPr>
+        <w:t xml:space="preserve"> Слава тобі, Христе Боже, надіє наша, слава тобі!</w:t>
       </w:r>
     </w:p>
     <w:p>
@@ -10775,17 +10783,13 @@
     </w:p>
     <w:p>
       <w:pPr>
-        <w:spacing w:line="240" w:lineRule="auto"/>
-        <w:rPr>
-          <w:rFonts w:ascii="Times New Roman" w:hAnsi="Times New Roman"/>
-          <w:sz w:val="24"/>
-        </w:rPr>
-      </w:pPr>
-      <w:r>
-        <w:rPr>
-          <w:rFonts w:ascii="Times New Roman" w:hAnsi="Times New Roman"/>
-          <w:i/>
-          <w:color w:val="FF0000"/>
+        <w:spacing w:after="120"/>
+      </w:pPr>
+      <w:r>
+        <w:rPr>
+          <w:rFonts w:ascii="Times New Roman" w:hAnsi="Times New Roman"/>
+          <w:i/>
+          <w:color w:val="FF4400"/>
           <w:sz w:val="24"/>
         </w:rPr>
         <w:t>Священик:</w:t>
@@ -10795,7 +10799,23 @@
           <w:rFonts w:ascii="Times New Roman" w:hAnsi="Times New Roman"/>
           <w:sz w:val="24"/>
         </w:rPr>
-        <w:t xml:space="preserve"> Христос, істинний Бог наш, молитвами пречистої своєї Матері, преподобних і богоносних отців наших, і всіх святих, помилує і спасе нас, як благий і чоловіколюбець.</w:t>
+        <w:t xml:space="preserve"> Христос, істинний Бог наш - молитвами пречистої Своєї Матері, силою чесного і животворчого Xреста, що з його чесним Древом походу сьогодні пам'ять звершуємо, святих славних і всехвальних апостолів, святого, </w:t>
+      </w:r>
+      <w:r>
+        <w:rPr>
+          <w:rFonts w:ascii="Times New Roman" w:hAnsi="Times New Roman"/>
+          <w:i/>
+          <w:color w:val="FF4400"/>
+          <w:sz w:val="24"/>
+        </w:rPr>
+        <w:t>якого є храм</w:t>
+      </w:r>
+      <w:r>
+        <w:rPr>
+          <w:rFonts w:ascii="Times New Roman" w:hAnsi="Times New Roman"/>
+          <w:sz w:val="24"/>
+        </w:rPr>
+        <w:t>, святих сімох мучеників Макавеїв, і матері їх Соломії, і старця Єлеазара, преподобного отця нашого Альфонса Лігуорі, і всіх святих - помилує і спасе нас як благий і людинолюбний.</w:t>
       </w:r>
     </w:p>
     <w:p>

</xml_diff>